<commit_message>
Se agrega unas modificaciones al doc de Word, en NaveVR se trato de probar las funciones de hand tracking, pero por cometarios de Yoas se cambiara el enfoque
</commit_message>
<xml_diff>
--- a/SOLICITUD DE TITULACIÓN POR TESIS.docx
+++ b/SOLICITUD DE TITULACIÓN POR TESIS.docx
@@ -81,6 +81,7 @@
     </w:p>
     <w:p>
       <w:pPr>
+        <w:jc w:val="both"/>
         <w:rPr>
           <w:rFonts w:ascii="Arial" w:hAnsi="Arial" w:cs="Arial"/>
           <w:b/>
@@ -100,6 +101,7 @@
     </w:p>
     <w:p>
       <w:pPr>
+        <w:jc w:val="both"/>
         <w:rPr>
           <w:rFonts w:ascii="Arial" w:hAnsi="Arial" w:cs="Arial"/>
           <w:b/>
@@ -290,6 +292,7 @@
     </w:p>
     <w:p>
       <w:pPr>
+        <w:jc w:val="both"/>
         <w:rPr>
           <w:rFonts w:ascii="Arial" w:hAnsi="Arial" w:cs="Arial"/>
           <w:sz w:val="24"/>
@@ -299,31 +302,19 @@
     </w:p>
     <w:p>
       <w:pPr>
-        <w:rPr>
-          <w:rFonts w:ascii="Arial" w:hAnsi="Arial" w:cs="Arial"/>
-          <w:b/>
-          <w:sz w:val="24"/>
-          <w:szCs w:val="24"/>
-        </w:rPr>
-      </w:pPr>
-      <w:r>
-        <w:rPr>
-          <w:rFonts w:ascii="Arial" w:hAnsi="Arial" w:cs="Arial"/>
-          <w:b/>
-          <w:sz w:val="24"/>
-          <w:szCs w:val="24"/>
-        </w:rPr>
-        <w:t>1.</w:t>
-      </w:r>
-      <w:r>
-        <w:rPr>
-          <w:rFonts w:ascii="Arial" w:hAnsi="Arial" w:cs="Arial"/>
-          <w:b/>
-          <w:sz w:val="24"/>
-          <w:szCs w:val="24"/>
-        </w:rPr>
-        <w:t xml:space="preserve"> </w:t>
-      </w:r>
+        <w:pStyle w:val="Prrafodelista"/>
+        <w:numPr>
+          <w:ilvl w:val="0"/>
+          <w:numId w:val="7"/>
+        </w:numPr>
+        <w:jc w:val="both"/>
+        <w:rPr>
+          <w:rFonts w:ascii="Arial" w:hAnsi="Arial" w:cs="Arial"/>
+          <w:b/>
+          <w:sz w:val="24"/>
+          <w:szCs w:val="24"/>
+        </w:rPr>
+      </w:pPr>
       <w:r>
         <w:rPr>
           <w:rFonts w:ascii="Arial" w:hAnsi="Arial" w:cs="Arial"/>
@@ -336,6 +327,8 @@
     </w:p>
     <w:p>
       <w:pPr>
+        <w:pStyle w:val="Prrafodelista"/>
+        <w:ind w:left="360"/>
         <w:jc w:val="both"/>
         <w:rPr>
           <w:rFonts w:ascii="Arial" w:hAnsi="Arial" w:cs="Arial"/>
@@ -349,12 +342,22 @@
           <w:sz w:val="24"/>
           <w:szCs w:val="24"/>
         </w:rPr>
-        <w:t xml:space="preserve">El objetivo de esta tesis es diseñar y programar una aplicación interactiva con mecánicas de juego enfocadas en el entrenamiento motor de movimientos de pronación, supinación, flexión y extensión de la muñeca, extensión y flexión de la mano, así como ejercicios del brazo sobre 3 planos, para los cuales se hará uso del dispositivo Meta </w:t>
+        <w:t xml:space="preserve">El objetivo de esta tesis es diseñar y programar una aplicación interactiva con mecánicas de juego enfocadas en el entrenamiento motor de movimientos de pronación, supinación, flexión y extensión de la muñeca, extensión y flexión de la mano, así como ejercicios del brazo sobre 3 planos, para los cuales se hará uso del dispositivo </w:t>
+      </w:r>
+      <w:r>
+        <w:rPr>
+          <w:rFonts w:ascii="Arial" w:hAnsi="Arial" w:cs="Arial"/>
+          <w:i/>
+          <w:sz w:val="24"/>
+          <w:szCs w:val="24"/>
+        </w:rPr>
+        <w:t xml:space="preserve">Meta </w:t>
       </w:r>
       <w:proofErr w:type="spellStart"/>
       <w:r>
         <w:rPr>
           <w:rFonts w:ascii="Arial" w:hAnsi="Arial" w:cs="Arial"/>
+          <w:i/>
           <w:sz w:val="24"/>
           <w:szCs w:val="24"/>
         </w:rPr>
@@ -364,10 +367,19 @@
       <w:r>
         <w:rPr>
           <w:rFonts w:ascii="Arial" w:hAnsi="Arial" w:cs="Arial"/>
-          <w:sz w:val="24"/>
-          <w:szCs w:val="24"/>
-        </w:rPr>
-        <w:t xml:space="preserve"> 3S, proporcionado por el Laboratorio de Investigación y Desarrollo de Aplicaciones Interactivas para la </w:t>
+          <w:i/>
+          <w:sz w:val="24"/>
+          <w:szCs w:val="24"/>
+        </w:rPr>
+        <w:t xml:space="preserve"> 3S</w:t>
+      </w:r>
+      <w:r>
+        <w:rPr>
+          <w:rFonts w:ascii="Arial" w:hAnsi="Arial" w:cs="Arial"/>
+          <w:sz w:val="24"/>
+          <w:szCs w:val="24"/>
+        </w:rPr>
+        <w:t xml:space="preserve">, proporcionado por el Laboratorio de Investigación y Desarrollo de Aplicaciones Interactivas para la </w:t>
       </w:r>
       <w:proofErr w:type="spellStart"/>
       <w:r>
@@ -390,6 +402,8 @@
     </w:p>
     <w:p>
       <w:pPr>
+        <w:pStyle w:val="Prrafodelista"/>
+        <w:ind w:left="360"/>
         <w:jc w:val="both"/>
         <w:rPr>
           <w:rFonts w:ascii="Arial" w:hAnsi="Arial" w:cs="Arial"/>
@@ -400,6 +414,11 @@
     </w:p>
     <w:p>
       <w:pPr>
+        <w:pStyle w:val="Prrafodelista"/>
+        <w:numPr>
+          <w:ilvl w:val="0"/>
+          <w:numId w:val="7"/>
+        </w:numPr>
         <w:jc w:val="both"/>
         <w:rPr>
           <w:rFonts w:ascii="Arial" w:hAnsi="Arial" w:cs="Arial"/>
@@ -415,11 +434,16 @@
           <w:sz w:val="24"/>
           <w:szCs w:val="24"/>
         </w:rPr>
-        <w:t>2. Descripción</w:t>
+        <w:t>Descripción</w:t>
       </w:r>
     </w:p>
     <w:p>
       <w:pPr>
+        <w:pStyle w:val="Prrafodelista"/>
+        <w:numPr>
+          <w:ilvl w:val="0"/>
+          <w:numId w:val="7"/>
+        </w:numPr>
         <w:jc w:val="both"/>
         <w:rPr>
           <w:rFonts w:ascii="Arial" w:hAnsi="Arial" w:cs="Arial"/>
@@ -435,11 +459,16 @@
           <w:sz w:val="24"/>
           <w:szCs w:val="24"/>
         </w:rPr>
-        <w:t>3. Justificación</w:t>
+        <w:t>Justificación</w:t>
       </w:r>
     </w:p>
     <w:p>
       <w:pPr>
+        <w:pStyle w:val="Prrafodelista"/>
+        <w:numPr>
+          <w:ilvl w:val="0"/>
+          <w:numId w:val="7"/>
+        </w:numPr>
         <w:jc w:val="both"/>
         <w:rPr>
           <w:rFonts w:ascii="Arial" w:hAnsi="Arial" w:cs="Arial"/>
@@ -455,11 +484,16 @@
           <w:sz w:val="24"/>
           <w:szCs w:val="24"/>
         </w:rPr>
-        <w:t>4. Herramientas tecnológicas</w:t>
+        <w:t>Herramientas Tecnológicas</w:t>
       </w:r>
     </w:p>
     <w:p>
       <w:pPr>
+        <w:pStyle w:val="Prrafodelista"/>
+        <w:numPr>
+          <w:ilvl w:val="1"/>
+          <w:numId w:val="7"/>
+        </w:numPr>
         <w:jc w:val="both"/>
         <w:rPr>
           <w:rFonts w:ascii="Arial" w:hAnsi="Arial" w:cs="Arial"/>
@@ -475,51 +509,211 @@
           <w:sz w:val="24"/>
           <w:szCs w:val="24"/>
         </w:rPr>
-        <w:t>5. Metodología de desarrollo de software</w:t>
+        <w:t xml:space="preserve"> </w:t>
+      </w:r>
+      <w:r>
+        <w:rPr>
+          <w:rFonts w:ascii="Arial" w:hAnsi="Arial" w:cs="Arial"/>
+          <w:b/>
+          <w:sz w:val="24"/>
+          <w:szCs w:val="24"/>
+        </w:rPr>
+        <w:t xml:space="preserve">Dispositivo interactivo: </w:t>
+      </w:r>
+      <w:r>
+        <w:rPr>
+          <w:rFonts w:ascii="Arial" w:hAnsi="Arial" w:cs="Arial"/>
+          <w:b/>
+          <w:i/>
+          <w:sz w:val="24"/>
+          <w:szCs w:val="24"/>
+        </w:rPr>
+        <w:t xml:space="preserve">Meta </w:t>
+      </w:r>
+      <w:proofErr w:type="spellStart"/>
+      <w:r>
+        <w:rPr>
+          <w:rFonts w:ascii="Arial" w:hAnsi="Arial" w:cs="Arial"/>
+          <w:b/>
+          <w:i/>
+          <w:sz w:val="24"/>
+          <w:szCs w:val="24"/>
+        </w:rPr>
+        <w:t>Quest</w:t>
+      </w:r>
+      <w:proofErr w:type="spellEnd"/>
+      <w:r>
+        <w:rPr>
+          <w:rFonts w:ascii="Arial" w:hAnsi="Arial" w:cs="Arial"/>
+          <w:b/>
+          <w:i/>
+          <w:sz w:val="24"/>
+          <w:szCs w:val="24"/>
+        </w:rPr>
+        <w:t xml:space="preserve"> 3S</w:t>
       </w:r>
     </w:p>
     <w:p>
       <w:pPr>
+        <w:pStyle w:val="Prrafodelista"/>
+        <w:ind w:left="792"/>
         <w:jc w:val="both"/>
         <w:rPr>
           <w:rFonts w:ascii="Arial" w:hAnsi="Arial" w:cs="Arial"/>
-          <w:b/>
-          <w:sz w:val="24"/>
-          <w:szCs w:val="24"/>
-        </w:rPr>
-      </w:pPr>
-      <w:r>
-        <w:rPr>
-          <w:rFonts w:ascii="Arial" w:hAnsi="Arial" w:cs="Arial"/>
-          <w:b/>
-          <w:sz w:val="24"/>
-          <w:szCs w:val="24"/>
-        </w:rPr>
-        <w:t xml:space="preserve">6. </w:t>
+          <w:sz w:val="24"/>
+          <w:szCs w:val="24"/>
+        </w:rPr>
+      </w:pPr>
+      <w:r>
+        <w:rPr>
+          <w:rFonts w:ascii="Arial" w:hAnsi="Arial" w:cs="Arial"/>
+          <w:sz w:val="24"/>
+          <w:szCs w:val="24"/>
+        </w:rPr>
+        <w:t xml:space="preserve">La aplicación interactiva se controlará empleando el visor de </w:t>
+      </w:r>
+      <w:r>
+        <w:rPr>
+          <w:rFonts w:ascii="Arial" w:hAnsi="Arial" w:cs="Arial"/>
+          <w:i/>
+          <w:sz w:val="24"/>
+          <w:szCs w:val="24"/>
+        </w:rPr>
+        <w:t xml:space="preserve">realidad virtual </w:t>
+      </w:r>
+      <w:r>
+        <w:rPr>
+          <w:rFonts w:ascii="Arial" w:hAnsi="Arial" w:cs="Arial"/>
+          <w:sz w:val="24"/>
+          <w:szCs w:val="24"/>
+        </w:rPr>
+        <w:t xml:space="preserve">de </w:t>
+      </w:r>
+      <w:r>
+        <w:rPr>
+          <w:rFonts w:ascii="Arial" w:hAnsi="Arial" w:cs="Arial"/>
+          <w:i/>
+          <w:sz w:val="24"/>
+          <w:szCs w:val="24"/>
+        </w:rPr>
+        <w:t xml:space="preserve">Meta </w:t>
       </w:r>
       <w:proofErr w:type="spellStart"/>
       <w:r>
         <w:rPr>
           <w:rFonts w:ascii="Arial" w:hAnsi="Arial" w:cs="Arial"/>
-          <w:b/>
-          <w:sz w:val="24"/>
-          <w:szCs w:val="24"/>
-        </w:rPr>
-        <w:t>Indice</w:t>
+          <w:i/>
+          <w:sz w:val="24"/>
+          <w:szCs w:val="24"/>
+        </w:rPr>
+        <w:t>Quest</w:t>
       </w:r>
       <w:proofErr w:type="spellEnd"/>
       <w:r>
         <w:rPr>
           <w:rFonts w:ascii="Arial" w:hAnsi="Arial" w:cs="Arial"/>
-          <w:b/>
-          <w:sz w:val="24"/>
-          <w:szCs w:val="24"/>
-        </w:rPr>
-        <w:t xml:space="preserve"> tentativo</w:t>
+          <w:i/>
+          <w:sz w:val="24"/>
+          <w:szCs w:val="24"/>
+        </w:rPr>
+        <w:t xml:space="preserve"> 3S</w:t>
+      </w:r>
+      <w:r>
+        <w:rPr>
+          <w:rFonts w:ascii="Arial" w:hAnsi="Arial" w:cs="Arial"/>
+          <w:sz w:val="24"/>
+          <w:szCs w:val="24"/>
+        </w:rPr>
+        <w:t xml:space="preserve">. </w:t>
+      </w:r>
+      <w:r>
+        <w:rPr>
+          <w:rFonts w:ascii="Arial" w:hAnsi="Arial" w:cs="Arial"/>
+          <w:sz w:val="24"/>
+          <w:szCs w:val="24"/>
+        </w:rPr>
+        <w:t xml:space="preserve">El dispositivo también funciona como herramienta de desarrollo ya que, mediante una conexión </w:t>
+      </w:r>
+      <w:r>
+        <w:rPr>
+          <w:rFonts w:ascii="Arial" w:hAnsi="Arial" w:cs="Arial"/>
+          <w:i/>
+          <w:sz w:val="24"/>
+          <w:szCs w:val="24"/>
+        </w:rPr>
+        <w:t>USB</w:t>
+      </w:r>
+      <w:r>
+        <w:rPr>
+          <w:rFonts w:ascii="Arial" w:hAnsi="Arial" w:cs="Arial"/>
+          <w:sz w:val="24"/>
+          <w:szCs w:val="24"/>
+        </w:rPr>
+        <w:t>,</w:t>
+      </w:r>
+      <w:r>
+        <w:rPr>
+          <w:rFonts w:ascii="Arial" w:hAnsi="Arial" w:cs="Arial"/>
+          <w:i/>
+          <w:sz w:val="24"/>
+          <w:szCs w:val="24"/>
+        </w:rPr>
+        <w:t xml:space="preserve"> </w:t>
+      </w:r>
+      <w:r>
+        <w:rPr>
+          <w:rFonts w:ascii="Arial" w:hAnsi="Arial" w:cs="Arial"/>
+          <w:sz w:val="24"/>
+          <w:szCs w:val="24"/>
+        </w:rPr>
+        <w:t xml:space="preserve">permite probar lo que se va implementando en la </w:t>
+      </w:r>
+      <w:bookmarkStart w:id="0" w:name="_GoBack"/>
+      <w:bookmarkEnd w:id="0"/>
+      <w:r>
+        <w:rPr>
+          <w:rFonts w:ascii="Arial" w:hAnsi="Arial" w:cs="Arial"/>
+          <w:sz w:val="24"/>
+          <w:szCs w:val="24"/>
+        </w:rPr>
+        <w:t xml:space="preserve">aplicación, así como el funcionamiento correcto del </w:t>
+      </w:r>
+      <w:proofErr w:type="spellStart"/>
+      <w:r>
+        <w:rPr>
+          <w:rFonts w:ascii="Arial" w:hAnsi="Arial" w:cs="Arial"/>
+          <w:i/>
+          <w:sz w:val="24"/>
+          <w:szCs w:val="24"/>
+        </w:rPr>
+        <w:t>hand</w:t>
+      </w:r>
+      <w:proofErr w:type="spellEnd"/>
+      <w:r>
+        <w:rPr>
+          <w:rFonts w:ascii="Arial" w:hAnsi="Arial" w:cs="Arial"/>
+          <w:i/>
+          <w:sz w:val="24"/>
+          <w:szCs w:val="24"/>
+        </w:rPr>
+        <w:t xml:space="preserve"> tracking</w:t>
+      </w:r>
+      <w:r>
+        <w:rPr>
+          <w:rFonts w:ascii="Arial" w:hAnsi="Arial" w:cs="Arial"/>
+          <w:sz w:val="24"/>
+          <w:szCs w:val="24"/>
+        </w:rPr>
+        <w:t>.</w:t>
       </w:r>
     </w:p>
     <w:p>
       <w:pPr>
+        <w:pStyle w:val="Prrafodelista"/>
+        <w:numPr>
+          <w:ilvl w:val="1"/>
+          <w:numId w:val="7"/>
+        </w:numPr>
         <w:jc w:val="both"/>
         <w:rPr>
           <w:rFonts w:ascii="Arial" w:hAnsi="Arial" w:cs="Arial"/>
@@ -535,11 +729,25 @@
           <w:sz w:val="24"/>
           <w:szCs w:val="24"/>
         </w:rPr>
-        <w:t>7. Propuesta de bibliografía</w:t>
-      </w:r>
+        <w:t xml:space="preserve"> Motor de desarrollo: </w:t>
+      </w:r>
+      <w:proofErr w:type="spellStart"/>
+      <w:r>
+        <w:rPr>
+          <w:rFonts w:ascii="Arial" w:hAnsi="Arial" w:cs="Arial"/>
+          <w:b/>
+          <w:i/>
+          <w:sz w:val="24"/>
+          <w:szCs w:val="24"/>
+        </w:rPr>
+        <w:t>Unity</w:t>
+      </w:r>
+      <w:proofErr w:type="spellEnd"/>
     </w:p>
     <w:p>
       <w:pPr>
+        <w:pStyle w:val="Prrafodelista"/>
+        <w:ind w:left="792"/>
         <w:jc w:val="both"/>
         <w:rPr>
           <w:rFonts w:ascii="Arial" w:hAnsi="Arial" w:cs="Arial"/>
@@ -547,8 +755,353 @@
           <w:szCs w:val="24"/>
         </w:rPr>
       </w:pPr>
-      <w:bookmarkStart w:id="0" w:name="_GoBack"/>
-      <w:bookmarkEnd w:id="0"/>
+      <w:r>
+        <w:rPr>
+          <w:rFonts w:ascii="Arial" w:hAnsi="Arial" w:cs="Arial"/>
+          <w:sz w:val="24"/>
+          <w:szCs w:val="24"/>
+        </w:rPr>
+        <w:t>Para el desarrollo de la aplicación se utilizará el moto</w:t>
+      </w:r>
+      <w:r>
+        <w:rPr>
+          <w:rFonts w:ascii="Arial" w:hAnsi="Arial" w:cs="Arial"/>
+          <w:sz w:val="24"/>
+          <w:szCs w:val="24"/>
+        </w:rPr>
+        <w:t>r</w:t>
+      </w:r>
+      <w:r>
+        <w:rPr>
+          <w:rFonts w:ascii="Arial" w:hAnsi="Arial" w:cs="Arial"/>
+          <w:sz w:val="24"/>
+          <w:szCs w:val="24"/>
+        </w:rPr>
+        <w:t xml:space="preserve"> de videojuegos </w:t>
+      </w:r>
+      <w:proofErr w:type="spellStart"/>
+      <w:r>
+        <w:rPr>
+          <w:rFonts w:ascii="Arial" w:hAnsi="Arial" w:cs="Arial"/>
+          <w:i/>
+          <w:sz w:val="24"/>
+          <w:szCs w:val="24"/>
+        </w:rPr>
+        <w:t>Unity</w:t>
+      </w:r>
+      <w:proofErr w:type="spellEnd"/>
+      <w:r>
+        <w:rPr>
+          <w:rFonts w:ascii="Arial" w:hAnsi="Arial" w:cs="Arial"/>
+          <w:sz w:val="24"/>
+          <w:szCs w:val="24"/>
+        </w:rPr>
+        <w:t xml:space="preserve"> en su versión </w:t>
+      </w:r>
+      <w:r>
+        <w:rPr>
+          <w:rFonts w:ascii="Arial" w:hAnsi="Arial" w:cs="Arial"/>
+          <w:sz w:val="24"/>
+          <w:szCs w:val="24"/>
+        </w:rPr>
+        <w:t xml:space="preserve">6000.3.8f1. Este motor además de proporcionar herramientas gráficas que facilitan la creación de entornos de juego atractivos, permite la interacción con el entorno de desarrollo </w:t>
+      </w:r>
+      <w:r>
+        <w:rPr>
+          <w:rFonts w:ascii="Arial" w:hAnsi="Arial" w:cs="Arial"/>
+          <w:i/>
+          <w:sz w:val="24"/>
+          <w:szCs w:val="24"/>
+        </w:rPr>
+        <w:t>Meta XR Simulator</w:t>
+      </w:r>
+      <w:r>
+        <w:rPr>
+          <w:rFonts w:ascii="Arial" w:hAnsi="Arial" w:cs="Arial"/>
+          <w:sz w:val="24"/>
+          <w:szCs w:val="24"/>
+        </w:rPr>
+        <w:t xml:space="preserve">, que brinda </w:t>
+      </w:r>
+      <w:proofErr w:type="spellStart"/>
+      <w:r>
+        <w:rPr>
+          <w:rFonts w:ascii="Arial" w:hAnsi="Arial" w:cs="Arial"/>
+          <w:i/>
+          <w:sz w:val="24"/>
+          <w:szCs w:val="24"/>
+        </w:rPr>
+        <w:t>building</w:t>
+      </w:r>
+      <w:proofErr w:type="spellEnd"/>
+      <w:r>
+        <w:rPr>
+          <w:rFonts w:ascii="Arial" w:hAnsi="Arial" w:cs="Arial"/>
+          <w:i/>
+          <w:sz w:val="24"/>
+          <w:szCs w:val="24"/>
+        </w:rPr>
+        <w:t xml:space="preserve"> blocks </w:t>
+      </w:r>
+      <w:r>
+        <w:rPr>
+          <w:rFonts w:ascii="Arial" w:hAnsi="Arial" w:cs="Arial"/>
+          <w:sz w:val="24"/>
+          <w:szCs w:val="24"/>
+        </w:rPr>
+        <w:t xml:space="preserve">necesarios para la creación de </w:t>
+      </w:r>
+      <w:r>
+        <w:rPr>
+          <w:rFonts w:ascii="Arial" w:hAnsi="Arial" w:cs="Arial"/>
+          <w:sz w:val="24"/>
+          <w:szCs w:val="24"/>
+        </w:rPr>
+        <w:lastRenderedPageBreak/>
+        <w:t xml:space="preserve">aplicaciones en </w:t>
+      </w:r>
+      <w:r>
+        <w:rPr>
+          <w:rFonts w:ascii="Arial" w:hAnsi="Arial" w:cs="Arial"/>
+          <w:i/>
+          <w:sz w:val="24"/>
+          <w:szCs w:val="24"/>
+        </w:rPr>
+        <w:t>Realidad Virtual</w:t>
+      </w:r>
+      <w:r>
+        <w:rPr>
+          <w:rFonts w:ascii="Arial" w:hAnsi="Arial" w:cs="Arial"/>
+          <w:sz w:val="24"/>
+          <w:szCs w:val="24"/>
+        </w:rPr>
+        <w:t xml:space="preserve">. </w:t>
+      </w:r>
+      <w:proofErr w:type="spellStart"/>
+      <w:r>
+        <w:rPr>
+          <w:rFonts w:ascii="Arial" w:hAnsi="Arial" w:cs="Arial"/>
+          <w:sz w:val="24"/>
+          <w:szCs w:val="24"/>
+        </w:rPr>
+        <w:t>Unity</w:t>
+      </w:r>
+      <w:proofErr w:type="spellEnd"/>
+      <w:r>
+        <w:rPr>
+          <w:rFonts w:ascii="Arial" w:hAnsi="Arial" w:cs="Arial"/>
+          <w:sz w:val="24"/>
+          <w:szCs w:val="24"/>
+        </w:rPr>
+        <w:t xml:space="preserve"> ofrece una licencia gratuita y permite desarrollar </w:t>
+      </w:r>
+      <w:proofErr w:type="spellStart"/>
+      <w:r>
+        <w:rPr>
+          <w:rFonts w:ascii="Arial" w:hAnsi="Arial" w:cs="Arial"/>
+          <w:sz w:val="24"/>
+          <w:szCs w:val="24"/>
+        </w:rPr>
+        <w:t>aplicacines</w:t>
+      </w:r>
+      <w:proofErr w:type="spellEnd"/>
+      <w:r>
+        <w:rPr>
+          <w:rFonts w:ascii="Arial" w:hAnsi="Arial" w:cs="Arial"/>
+          <w:sz w:val="24"/>
+          <w:szCs w:val="24"/>
+        </w:rPr>
+        <w:t xml:space="preserve"> compatibles con diversos Sistemas Operativos (Windows, Android, </w:t>
+      </w:r>
+      <w:proofErr w:type="spellStart"/>
+      <w:r>
+        <w:rPr>
+          <w:rFonts w:ascii="Arial" w:hAnsi="Arial" w:cs="Arial"/>
+          <w:sz w:val="24"/>
+          <w:szCs w:val="24"/>
+        </w:rPr>
+        <w:t>macOS</w:t>
+      </w:r>
+      <w:proofErr w:type="spellEnd"/>
+      <w:r>
+        <w:rPr>
+          <w:rFonts w:ascii="Arial" w:hAnsi="Arial" w:cs="Arial"/>
+          <w:sz w:val="24"/>
+          <w:szCs w:val="24"/>
+        </w:rPr>
+        <w:t>, Linux, etc.).</w:t>
+      </w:r>
+    </w:p>
+    <w:p>
+      <w:pPr>
+        <w:pStyle w:val="Prrafodelista"/>
+        <w:numPr>
+          <w:ilvl w:val="1"/>
+          <w:numId w:val="7"/>
+        </w:numPr>
+        <w:jc w:val="both"/>
+        <w:rPr>
+          <w:rFonts w:ascii="Arial" w:hAnsi="Arial" w:cs="Arial"/>
+          <w:b/>
+          <w:sz w:val="24"/>
+          <w:szCs w:val="24"/>
+        </w:rPr>
+      </w:pPr>
+      <w:r>
+        <w:rPr>
+          <w:rFonts w:ascii="Arial" w:hAnsi="Arial" w:cs="Arial"/>
+          <w:b/>
+          <w:sz w:val="24"/>
+          <w:szCs w:val="24"/>
+        </w:rPr>
+        <w:t xml:space="preserve"> Lenguaje de programación: </w:t>
+      </w:r>
+      <w:r>
+        <w:rPr>
+          <w:rFonts w:ascii="Arial" w:hAnsi="Arial" w:cs="Arial"/>
+          <w:b/>
+          <w:i/>
+          <w:sz w:val="24"/>
+          <w:szCs w:val="24"/>
+        </w:rPr>
+        <w:t>C#</w:t>
+      </w:r>
+    </w:p>
+    <w:p>
+      <w:pPr>
+        <w:pStyle w:val="Prrafodelista"/>
+        <w:ind w:left="792"/>
+        <w:jc w:val="both"/>
+        <w:rPr>
+          <w:rFonts w:ascii="Arial" w:hAnsi="Arial" w:cs="Arial"/>
+          <w:sz w:val="24"/>
+          <w:szCs w:val="24"/>
+        </w:rPr>
+      </w:pPr>
+      <w:proofErr w:type="spellStart"/>
+      <w:r>
+        <w:rPr>
+          <w:rFonts w:ascii="Arial" w:hAnsi="Arial" w:cs="Arial"/>
+          <w:i/>
+          <w:sz w:val="24"/>
+          <w:szCs w:val="24"/>
+        </w:rPr>
+        <w:t>Unity</w:t>
+      </w:r>
+      <w:proofErr w:type="spellEnd"/>
+      <w:r>
+        <w:rPr>
+          <w:rFonts w:ascii="Arial" w:hAnsi="Arial" w:cs="Arial"/>
+          <w:i/>
+          <w:sz w:val="24"/>
+          <w:szCs w:val="24"/>
+        </w:rPr>
+        <w:t xml:space="preserve"> </w:t>
+      </w:r>
+      <w:r>
+        <w:rPr>
+          <w:rFonts w:ascii="Arial" w:hAnsi="Arial" w:cs="Arial"/>
+          <w:sz w:val="24"/>
+          <w:szCs w:val="24"/>
+        </w:rPr>
+        <w:t>ofrece soporte exclusivo y optimizado</w:t>
+      </w:r>
+    </w:p>
+    <w:p>
+      <w:pPr>
+        <w:pStyle w:val="Prrafodelista"/>
+        <w:numPr>
+          <w:ilvl w:val="0"/>
+          <w:numId w:val="7"/>
+        </w:numPr>
+        <w:jc w:val="both"/>
+        <w:rPr>
+          <w:rFonts w:ascii="Arial" w:hAnsi="Arial" w:cs="Arial"/>
+          <w:b/>
+          <w:sz w:val="24"/>
+          <w:szCs w:val="24"/>
+        </w:rPr>
+      </w:pPr>
+      <w:r>
+        <w:rPr>
+          <w:rFonts w:ascii="Arial" w:hAnsi="Arial" w:cs="Arial"/>
+          <w:b/>
+          <w:sz w:val="24"/>
+          <w:szCs w:val="24"/>
+        </w:rPr>
+        <w:t>Metodología de desarrollo de software</w:t>
+      </w:r>
+    </w:p>
+    <w:p>
+      <w:pPr>
+        <w:pStyle w:val="Prrafodelista"/>
+        <w:numPr>
+          <w:ilvl w:val="0"/>
+          <w:numId w:val="7"/>
+        </w:numPr>
+        <w:jc w:val="both"/>
+        <w:rPr>
+          <w:rFonts w:ascii="Arial" w:hAnsi="Arial" w:cs="Arial"/>
+          <w:b/>
+          <w:sz w:val="24"/>
+          <w:szCs w:val="24"/>
+        </w:rPr>
+      </w:pPr>
+      <w:r>
+        <w:rPr>
+          <w:rFonts w:ascii="Arial" w:hAnsi="Arial" w:cs="Arial"/>
+          <w:b/>
+          <w:sz w:val="24"/>
+          <w:szCs w:val="24"/>
+        </w:rPr>
+        <w:t>Índice tentativo</w:t>
+      </w:r>
+    </w:p>
+    <w:p>
+      <w:pPr>
+        <w:pStyle w:val="Prrafodelista"/>
+        <w:numPr>
+          <w:ilvl w:val="0"/>
+          <w:numId w:val="7"/>
+        </w:numPr>
+        <w:jc w:val="both"/>
+        <w:rPr>
+          <w:rFonts w:ascii="Arial" w:hAnsi="Arial" w:cs="Arial"/>
+          <w:b/>
+          <w:sz w:val="24"/>
+          <w:szCs w:val="24"/>
+        </w:rPr>
+      </w:pPr>
+      <w:r>
+        <w:rPr>
+          <w:rFonts w:ascii="Arial" w:hAnsi="Arial" w:cs="Arial"/>
+          <w:b/>
+          <w:sz w:val="24"/>
+          <w:szCs w:val="24"/>
+        </w:rPr>
+        <w:t>Propuesta de bibliografía</w:t>
+      </w:r>
+    </w:p>
+    <w:p>
+      <w:pPr>
+        <w:jc w:val="both"/>
+        <w:rPr>
+          <w:rFonts w:ascii="Arial" w:hAnsi="Arial" w:cs="Arial"/>
+          <w:b/>
+          <w:sz w:val="24"/>
+          <w:szCs w:val="24"/>
+        </w:rPr>
+      </w:pPr>
+    </w:p>
+    <w:p>
+      <w:pPr>
+        <w:jc w:val="both"/>
+        <w:rPr>
+          <w:rFonts w:ascii="Arial" w:hAnsi="Arial" w:cs="Arial"/>
+          <w:sz w:val="24"/>
+          <w:szCs w:val="24"/>
+        </w:rPr>
+      </w:pPr>
     </w:p>
     <w:p>
       <w:pPr>
@@ -929,6 +1482,92 @@
     </w:lvl>
   </w:abstractNum>
   <w:abstractNum w:abstractNumId="4" w15:restartNumberingAfterBreak="0">
+    <w:nsid w:val="4E734B64"/>
+    <w:multiLevelType w:val="multilevel"/>
+    <w:tmpl w:val="0C0A001F"/>
+    <w:lvl w:ilvl="0">
+      <w:start w:val="1"/>
+      <w:numFmt w:val="decimal"/>
+      <w:lvlText w:val="%1."/>
+      <w:lvlJc w:val="left"/>
+      <w:pPr>
+        <w:ind w:left="360" w:hanging="360"/>
+      </w:pPr>
+    </w:lvl>
+    <w:lvl w:ilvl="1">
+      <w:start w:val="1"/>
+      <w:numFmt w:val="decimal"/>
+      <w:lvlText w:val="%1.%2."/>
+      <w:lvlJc w:val="left"/>
+      <w:pPr>
+        <w:ind w:left="792" w:hanging="432"/>
+      </w:pPr>
+    </w:lvl>
+    <w:lvl w:ilvl="2">
+      <w:start w:val="1"/>
+      <w:numFmt w:val="decimal"/>
+      <w:lvlText w:val="%1.%2.%3."/>
+      <w:lvlJc w:val="left"/>
+      <w:pPr>
+        <w:ind w:left="1224" w:hanging="504"/>
+      </w:pPr>
+    </w:lvl>
+    <w:lvl w:ilvl="3">
+      <w:start w:val="1"/>
+      <w:numFmt w:val="decimal"/>
+      <w:lvlText w:val="%1.%2.%3.%4."/>
+      <w:lvlJc w:val="left"/>
+      <w:pPr>
+        <w:ind w:left="1728" w:hanging="648"/>
+      </w:pPr>
+    </w:lvl>
+    <w:lvl w:ilvl="4">
+      <w:start w:val="1"/>
+      <w:numFmt w:val="decimal"/>
+      <w:lvlText w:val="%1.%2.%3.%4.%5."/>
+      <w:lvlJc w:val="left"/>
+      <w:pPr>
+        <w:ind w:left="2232" w:hanging="792"/>
+      </w:pPr>
+    </w:lvl>
+    <w:lvl w:ilvl="5">
+      <w:start w:val="1"/>
+      <w:numFmt w:val="decimal"/>
+      <w:lvlText w:val="%1.%2.%3.%4.%5.%6."/>
+      <w:lvlJc w:val="left"/>
+      <w:pPr>
+        <w:ind w:left="2736" w:hanging="936"/>
+      </w:pPr>
+    </w:lvl>
+    <w:lvl w:ilvl="6">
+      <w:start w:val="1"/>
+      <w:numFmt w:val="decimal"/>
+      <w:lvlText w:val="%1.%2.%3.%4.%5.%6.%7."/>
+      <w:lvlJc w:val="left"/>
+      <w:pPr>
+        <w:ind w:left="3240" w:hanging="1080"/>
+      </w:pPr>
+    </w:lvl>
+    <w:lvl w:ilvl="7">
+      <w:start w:val="1"/>
+      <w:numFmt w:val="decimal"/>
+      <w:lvlText w:val="%1.%2.%3.%4.%5.%6.%7.%8."/>
+      <w:lvlJc w:val="left"/>
+      <w:pPr>
+        <w:ind w:left="3744" w:hanging="1224"/>
+      </w:pPr>
+    </w:lvl>
+    <w:lvl w:ilvl="8">
+      <w:start w:val="1"/>
+      <w:numFmt w:val="decimal"/>
+      <w:lvlText w:val="%1.%2.%3.%4.%5.%6.%7.%8.%9."/>
+      <w:lvlJc w:val="left"/>
+      <w:pPr>
+        <w:ind w:left="4320" w:hanging="1440"/>
+      </w:pPr>
+    </w:lvl>
+  </w:abstractNum>
+  <w:abstractNum w:abstractNumId="5" w15:restartNumberingAfterBreak="0">
     <w:nsid w:val="52A67267"/>
     <w:multiLevelType w:val="hybridMultilevel"/>
     <w:tmpl w:val="F06636D8"/>
@@ -1017,7 +1656,7 @@
       </w:pPr>
     </w:lvl>
   </w:abstractNum>
-  <w:abstractNum w:abstractNumId="5" w15:restartNumberingAfterBreak="0">
+  <w:abstractNum w:abstractNumId="6" w15:restartNumberingAfterBreak="0">
     <w:nsid w:val="5FC96DC6"/>
     <w:multiLevelType w:val="hybridMultilevel"/>
     <w:tmpl w:val="C0A61450"/>
@@ -1032,6 +1671,95 @@
       <w:rPr>
         <w:rFonts w:hint="default"/>
         <w:b/>
+      </w:rPr>
+    </w:lvl>
+    <w:lvl w:ilvl="1" w:tplc="0C0A0019" w:tentative="1">
+      <w:start w:val="1"/>
+      <w:numFmt w:val="lowerLetter"/>
+      <w:lvlText w:val="%2."/>
+      <w:lvlJc w:val="left"/>
+      <w:pPr>
+        <w:ind w:left="1440" w:hanging="360"/>
+      </w:pPr>
+    </w:lvl>
+    <w:lvl w:ilvl="2" w:tplc="0C0A001B" w:tentative="1">
+      <w:start w:val="1"/>
+      <w:numFmt w:val="lowerRoman"/>
+      <w:lvlText w:val="%3."/>
+      <w:lvlJc w:val="right"/>
+      <w:pPr>
+        <w:ind w:left="2160" w:hanging="180"/>
+      </w:pPr>
+    </w:lvl>
+    <w:lvl w:ilvl="3" w:tplc="0C0A000F" w:tentative="1">
+      <w:start w:val="1"/>
+      <w:numFmt w:val="decimal"/>
+      <w:lvlText w:val="%4."/>
+      <w:lvlJc w:val="left"/>
+      <w:pPr>
+        <w:ind w:left="2880" w:hanging="360"/>
+      </w:pPr>
+    </w:lvl>
+    <w:lvl w:ilvl="4" w:tplc="0C0A0019" w:tentative="1">
+      <w:start w:val="1"/>
+      <w:numFmt w:val="lowerLetter"/>
+      <w:lvlText w:val="%5."/>
+      <w:lvlJc w:val="left"/>
+      <w:pPr>
+        <w:ind w:left="3600" w:hanging="360"/>
+      </w:pPr>
+    </w:lvl>
+    <w:lvl w:ilvl="5" w:tplc="0C0A001B" w:tentative="1">
+      <w:start w:val="1"/>
+      <w:numFmt w:val="lowerRoman"/>
+      <w:lvlText w:val="%6."/>
+      <w:lvlJc w:val="right"/>
+      <w:pPr>
+        <w:ind w:left="4320" w:hanging="180"/>
+      </w:pPr>
+    </w:lvl>
+    <w:lvl w:ilvl="6" w:tplc="0C0A000F" w:tentative="1">
+      <w:start w:val="1"/>
+      <w:numFmt w:val="decimal"/>
+      <w:lvlText w:val="%7."/>
+      <w:lvlJc w:val="left"/>
+      <w:pPr>
+        <w:ind w:left="5040" w:hanging="360"/>
+      </w:pPr>
+    </w:lvl>
+    <w:lvl w:ilvl="7" w:tplc="0C0A0019" w:tentative="1">
+      <w:start w:val="1"/>
+      <w:numFmt w:val="lowerLetter"/>
+      <w:lvlText w:val="%8."/>
+      <w:lvlJc w:val="left"/>
+      <w:pPr>
+        <w:ind w:left="5760" w:hanging="360"/>
+      </w:pPr>
+    </w:lvl>
+    <w:lvl w:ilvl="8" w:tplc="0C0A001B" w:tentative="1">
+      <w:start w:val="1"/>
+      <w:numFmt w:val="lowerRoman"/>
+      <w:lvlText w:val="%9."/>
+      <w:lvlJc w:val="right"/>
+      <w:pPr>
+        <w:ind w:left="6480" w:hanging="180"/>
+      </w:pPr>
+    </w:lvl>
+  </w:abstractNum>
+  <w:abstractNum w:abstractNumId="7" w15:restartNumberingAfterBreak="0">
+    <w:nsid w:val="743D0693"/>
+    <w:multiLevelType w:val="hybridMultilevel"/>
+    <w:tmpl w:val="19B0BA48"/>
+    <w:lvl w:ilvl="0" w:tplc="0C0A000F">
+      <w:start w:val="1"/>
+      <w:numFmt w:val="decimal"/>
+      <w:lvlText w:val="%1."/>
+      <w:lvlJc w:val="left"/>
+      <w:pPr>
+        <w:ind w:left="720" w:hanging="360"/>
+      </w:pPr>
+      <w:rPr>
+        <w:rFonts w:hint="default"/>
       </w:rPr>
     </w:lvl>
     <w:lvl w:ilvl="1" w:tplc="0C0A0019" w:tentative="1">
@@ -1117,13 +1845,19 @@
     <w:abstractNumId w:val="2"/>
   </w:num>
   <w:num w:numId="4">
-    <w:abstractNumId w:val="5"/>
+    <w:abstractNumId w:val="6"/>
   </w:num>
   <w:num w:numId="5">
     <w:abstractNumId w:val="1"/>
   </w:num>
   <w:num w:numId="6">
+    <w:abstractNumId w:val="5"/>
+  </w:num>
+  <w:num w:numId="7">
     <w:abstractNumId w:val="4"/>
+  </w:num>
+  <w:num w:numId="8">
+    <w:abstractNumId w:val="7"/>
   </w:num>
 </w:numbering>
 </file>

</xml_diff>

<commit_message>
Se agrega unas leves modificaciones a la solicitud de tesis y un sistema para el monitoreo y calibracion de la extension y flexion de la muneca, aun falta ajustar detalles
</commit_message>
<xml_diff>
--- a/SOLICITUD DE TITULACIÓN POR TESIS.docx
+++ b/SOLICITUD DE TITULACIÓN POR TESIS.docx
@@ -189,7 +189,7 @@
           <w:sz w:val="24"/>
           <w:szCs w:val="24"/>
         </w:rPr>
-        <w:t>neurorehabilitación</w:t>
+        <w:t>neuro</w:t>
       </w:r>
       <w:proofErr w:type="spellEnd"/>
       <w:r>
@@ -199,7 +199,16 @@
           <w:sz w:val="24"/>
           <w:szCs w:val="24"/>
         </w:rPr>
-        <w:t xml:space="preserve"> de </w:t>
+        <w:t>-</w:t>
+      </w:r>
+      <w:r>
+        <w:rPr>
+          <w:rFonts w:ascii="Arial" w:hAnsi="Arial" w:cs="Arial"/>
+          <w:b/>
+          <w:sz w:val="24"/>
+          <w:szCs w:val="24"/>
+        </w:rPr>
+        <w:t xml:space="preserve">rehabilitación de </w:t>
       </w:r>
       <w:r>
         <w:rPr>
@@ -666,17 +675,7 @@
           <w:sz w:val="24"/>
           <w:szCs w:val="24"/>
         </w:rPr>
-        <w:t xml:space="preserve">permite probar lo que se va implementando en la </w:t>
-      </w:r>
-      <w:bookmarkStart w:id="0" w:name="_GoBack"/>
-      <w:bookmarkEnd w:id="0"/>
-      <w:r>
-        <w:rPr>
-          <w:rFonts w:ascii="Arial" w:hAnsi="Arial" w:cs="Arial"/>
-          <w:sz w:val="24"/>
-          <w:szCs w:val="24"/>
-        </w:rPr>
-        <w:t xml:space="preserve">aplicación, así como el funcionamiento correcto del </w:t>
+        <w:t xml:space="preserve">permite probar lo que se va implementando en la aplicación, así como el funcionamiento correcto del </w:t>
       </w:r>
       <w:proofErr w:type="spellStart"/>
       <w:r>
@@ -1006,6 +1005,76 @@
         </w:rPr>
         <w:t>ofrece soporte exclusivo y optimizado</w:t>
       </w:r>
+      <w:r>
+        <w:rPr>
+          <w:rFonts w:ascii="Arial" w:hAnsi="Arial" w:cs="Arial"/>
+          <w:sz w:val="24"/>
+          <w:szCs w:val="24"/>
+        </w:rPr>
+        <w:t xml:space="preserve"> para </w:t>
+      </w:r>
+      <w:r>
+        <w:rPr>
+          <w:rFonts w:ascii="Arial" w:hAnsi="Arial" w:cs="Arial"/>
+          <w:i/>
+          <w:sz w:val="24"/>
+          <w:szCs w:val="24"/>
+        </w:rPr>
+        <w:t>C#</w:t>
+      </w:r>
+      <w:r>
+        <w:rPr>
+          <w:rFonts w:ascii="Arial" w:hAnsi="Arial" w:cs="Arial"/>
+          <w:sz w:val="24"/>
+          <w:szCs w:val="24"/>
+        </w:rPr>
+        <w:t xml:space="preserve">. Este al ser Orientado a Objetos, permite que la creación de código sea más organizada, lo cual es de mucha ayuda al estar manejando diferentes mecánicas de juego y sistemas de comunicación con hardware externo. También permite el uso de los </w:t>
+      </w:r>
+      <w:proofErr w:type="spellStart"/>
+      <w:r>
+        <w:rPr>
+          <w:rFonts w:ascii="Arial" w:hAnsi="Arial" w:cs="Arial"/>
+          <w:i/>
+          <w:sz w:val="24"/>
+          <w:szCs w:val="24"/>
+        </w:rPr>
+        <w:t>building</w:t>
+      </w:r>
+      <w:proofErr w:type="spellEnd"/>
+      <w:r>
+        <w:rPr>
+          <w:rFonts w:ascii="Arial" w:hAnsi="Arial" w:cs="Arial"/>
+          <w:i/>
+          <w:sz w:val="24"/>
+          <w:szCs w:val="24"/>
+        </w:rPr>
+        <w:t xml:space="preserve"> blocks </w:t>
+      </w:r>
+      <w:r>
+        <w:rPr>
+          <w:rFonts w:ascii="Arial" w:hAnsi="Arial" w:cs="Arial"/>
+          <w:sz w:val="24"/>
+          <w:szCs w:val="24"/>
+        </w:rPr>
+        <w:t xml:space="preserve">de </w:t>
+      </w:r>
+      <w:r>
+        <w:rPr>
+          <w:rFonts w:ascii="Arial" w:hAnsi="Arial" w:cs="Arial"/>
+          <w:i/>
+          <w:sz w:val="24"/>
+          <w:szCs w:val="24"/>
+        </w:rPr>
+        <w:t>Meta XR Simulator</w:t>
+      </w:r>
+      <w:r>
+        <w:rPr>
+          <w:rFonts w:ascii="Arial" w:hAnsi="Arial" w:cs="Arial"/>
+          <w:sz w:val="24"/>
+          <w:szCs w:val="24"/>
+        </w:rPr>
+        <w:t>, ya que estos se basan en dicho lenguaje.</w:t>
+      </w:r>
     </w:p>
     <w:p>
       <w:pPr>
@@ -1030,6 +1099,83 @@
           <w:szCs w:val="24"/>
         </w:rPr>
         <w:t>Metodología de desarrollo de software</w:t>
+      </w:r>
+      <w:bookmarkStart w:id="0" w:name="_GoBack"/>
+      <w:bookmarkEnd w:id="0"/>
+    </w:p>
+    <w:p>
+      <w:pPr>
+        <w:pStyle w:val="Prrafodelista"/>
+        <w:numPr>
+          <w:ilvl w:val="1"/>
+          <w:numId w:val="7"/>
+        </w:numPr>
+        <w:jc w:val="both"/>
+        <w:rPr>
+          <w:rFonts w:ascii="Arial" w:hAnsi="Arial" w:cs="Arial"/>
+          <w:b/>
+          <w:sz w:val="24"/>
+          <w:szCs w:val="24"/>
+        </w:rPr>
+      </w:pPr>
+      <w:r>
+        <w:rPr>
+          <w:rFonts w:ascii="Arial" w:hAnsi="Arial" w:cs="Arial"/>
+          <w:b/>
+          <w:sz w:val="24"/>
+          <w:szCs w:val="24"/>
+        </w:rPr>
+        <w:t>Investigación</w:t>
+      </w:r>
+    </w:p>
+    <w:p>
+      <w:pPr>
+        <w:pStyle w:val="Prrafodelista"/>
+        <w:numPr>
+          <w:ilvl w:val="1"/>
+          <w:numId w:val="7"/>
+        </w:numPr>
+        <w:jc w:val="both"/>
+        <w:rPr>
+          <w:rFonts w:ascii="Arial" w:hAnsi="Arial" w:cs="Arial"/>
+          <w:b/>
+          <w:sz w:val="24"/>
+          <w:szCs w:val="24"/>
+        </w:rPr>
+      </w:pPr>
+      <w:r>
+        <w:rPr>
+          <w:rFonts w:ascii="Arial" w:hAnsi="Arial" w:cs="Arial"/>
+          <w:b/>
+          <w:sz w:val="24"/>
+          <w:szCs w:val="24"/>
+        </w:rPr>
+        <w:t>Desarrollo e implementación incremental por etapas</w:t>
+      </w:r>
+    </w:p>
+    <w:p>
+      <w:pPr>
+        <w:pStyle w:val="Prrafodelista"/>
+        <w:numPr>
+          <w:ilvl w:val="1"/>
+          <w:numId w:val="7"/>
+        </w:numPr>
+        <w:jc w:val="both"/>
+        <w:rPr>
+          <w:rFonts w:ascii="Arial" w:hAnsi="Arial" w:cs="Arial"/>
+          <w:b/>
+          <w:sz w:val="24"/>
+          <w:szCs w:val="24"/>
+        </w:rPr>
+      </w:pPr>
+      <w:r>
+        <w:rPr>
+          <w:rFonts w:ascii="Arial" w:hAnsi="Arial" w:cs="Arial"/>
+          <w:b/>
+          <w:sz w:val="24"/>
+          <w:szCs w:val="24"/>
+        </w:rPr>
+        <w:t>Pruebas</w:t>
       </w:r>
     </w:p>
     <w:p>

</xml_diff>